<commit_message>
Update today's completed workout: 2026-08-25 Swim 3400m
</commit_message>
<xml_diff>
--- a/docs/weekly/2026-W35_當週執行率回顧報告.docx
+++ b/docs/weekly/2026-W35_當週執行率回顧報告.docx
@@ -21,7 +21,7 @@
           <w:color w:val="555555"/>
           <w:sz w:val="20"/>
         </w:rPr>
-        <w:t>週期：2026/08/24–2026/08/30　｜　整體時間執行率：0.0%</w:t>
+        <w:t>週期：2026/08/24–2026/08/30　｜　整體時間執行率：10.2%</w:t>
       </w:r>
     </w:p>
     <w:p>
@@ -347,7 +347,7 @@
                 <w:color w:val="000000"/>
                 <w:sz w:val="19"/>
               </w:rPr>
-              <w:t>0.00 hr</w:t>
+              <w:t>1.19 hr</w:t>
             </w:r>
           </w:p>
         </w:tc>
@@ -374,7 +374,7 @@
                 <w:color w:val="000000"/>
                 <w:sz w:val="19"/>
               </w:rPr>
-              <w:t>0.0%</w:t>
+              <w:t>31.7%</w:t>
             </w:r>
           </w:p>
         </w:tc>
@@ -428,7 +428,7 @@
                 <w:color w:val="000000"/>
                 <w:sz w:val="19"/>
               </w:rPr>
-              <w:t>0.00 km</w:t>
+              <w:t>3.40 km</w:t>
             </w:r>
           </w:p>
         </w:tc>
@@ -455,7 +455,7 @@
                 <w:color w:val="000000"/>
                 <w:sz w:val="19"/>
               </w:rPr>
-              <w:t>0.0%</w:t>
+              <w:t>113.3%</w:t>
             </w:r>
           </w:p>
         </w:tc>
@@ -1631,7 +1631,7 @@
                 <w:color w:val="000000"/>
                 <w:sz w:val="19"/>
               </w:rPr>
-              <w:t>0分</w:t>
+              <w:t>71.4分 / 3.40km</w:t>
             </w:r>
           </w:p>
         </w:tc>
@@ -1658,7 +1658,7 @@
                 <w:color w:val="000000"/>
                 <w:sz w:val="19"/>
               </w:rPr>
-              <w:t>❌ 未執行/待排程</w:t>
+              <w:t>🟢 良好達標 (89%, A-)</w:t>
             </w:r>
           </w:p>
         </w:tc>
@@ -2847,7 +2847,7 @@
     </w:p>
     <w:p>
       <w:r>
-        <w:t>• 當週累積自行車 0.00 km、跑步 0.00 km、游泳 0.00 km，整體時間執行率達 0.0%。</w:t>
+        <w:t>• 當週累積自行車 0.00 km、跑步 0.00 km、游泳 3.40 km，整體時間執行率達 10.2%。</w:t>
         <w:br/>
       </w:r>
       <w:r>

</xml_diff>

<commit_message>
Auto Daily 8:00 PM Dashboard Update [2026-08-25 20:00]
</commit_message>
<xml_diff>
--- a/docs/weekly/2026-W35_當週執行率回顧報告.docx
+++ b/docs/weekly/2026-W35_當週執行率回顧報告.docx
@@ -21,7 +21,7 @@
           <w:color w:val="555555"/>
           <w:sz w:val="20"/>
         </w:rPr>
-        <w:t>週期：2026/08/24–2026/08/30　｜　整體時間執行率：10.2%</w:t>
+        <w:t>週期：2026/08/24–2026/08/30　｜　整體時間執行率：10.1%</w:t>
       </w:r>
     </w:p>
     <w:p>
@@ -347,7 +347,7 @@
                 <w:color w:val="000000"/>
                 <w:sz w:val="19"/>
               </w:rPr>
-              <w:t>1.19 hr</w:t>
+              <w:t>1.18 hr</w:t>
             </w:r>
           </w:p>
         </w:tc>
@@ -374,7 +374,7 @@
                 <w:color w:val="000000"/>
                 <w:sz w:val="19"/>
               </w:rPr>
-              <w:t>31.7%</w:t>
+              <w:t>31.6%</w:t>
             </w:r>
           </w:p>
         </w:tc>
@@ -1631,7 +1631,7 @@
                 <w:color w:val="000000"/>
                 <w:sz w:val="19"/>
               </w:rPr>
-              <w:t>71.4分 / 3.40km</w:t>
+              <w:t>71分 / 3.40km</w:t>
             </w:r>
           </w:p>
         </w:tc>
@@ -2214,7 +2214,7 @@
                 <w:color w:val="000000"/>
                 <w:sz w:val="19"/>
               </w:rPr>
-              <w:t>Bike: TEMPO 350</w:t>
+              <w:t>Bike: 3.5</w:t>
             </w:r>
           </w:p>
         </w:tc>
@@ -2380,7 +2380,7 @@
                 <w:color w:val="000000"/>
                 <w:sz w:val="19"/>
               </w:rPr>
-              <w:t>Run: 轉換40分</w:t>
+              <w:t>Run: 轉換40分 （Z1~Z2）</w:t>
             </w:r>
           </w:p>
         </w:tc>
@@ -2546,7 +2546,7 @@
                 <w:color w:val="000000"/>
                 <w:sz w:val="19"/>
               </w:rPr>
-              <w:t>Run: 有氧打底</w:t>
+              <w:t>Run: EASY 75 (心率上限 140)</w:t>
             </w:r>
           </w:p>
         </w:tc>
@@ -2712,7 +2712,7 @@
                 <w:color w:val="000000"/>
                 <w:sz w:val="19"/>
               </w:rPr>
-              <w:t>Swim: 3000</w:t>
+              <w:t>Swim: 2600</w:t>
             </w:r>
           </w:p>
         </w:tc>
@@ -2847,7 +2847,7 @@
     </w:p>
     <w:p>
       <w:r>
-        <w:t>• 當週累積自行車 0.00 km、跑步 0.00 km、游泳 3.40 km，整體時間執行率達 10.2%。</w:t>
+        <w:t>• 當週累積自行車 0.00 km、跑步 0.00 km、游泳 3.40 km，整體時間執行率達 10.1%。</w:t>
         <w:br/>
       </w:r>
       <w:r>

</xml_diff>

<commit_message>
Update workout records & 2026-W35 execution report [2026-08-26]
</commit_message>
<xml_diff>
--- a/docs/weekly/2026-W35_當週執行率回顧報告.docx
+++ b/docs/weekly/2026-W35_當週執行率回顧報告.docx
@@ -21,7 +21,7 @@
           <w:color w:val="555555"/>
           <w:sz w:val="20"/>
         </w:rPr>
-        <w:t>週期：2026/08/24–2026/08/30　｜　整體時間執行率：10.1%</w:t>
+        <w:t>週期：2026/08/24–2026/08/30　｜　整體時間執行率：19.3%</w:t>
       </w:r>
     </w:p>
     <w:p>
@@ -783,7 +783,7 @@
                 <w:color w:val="000000"/>
                 <w:sz w:val="19"/>
               </w:rPr>
-              <w:t>0.00 hr</w:t>
+              <w:t>1.07 hr</w:t>
             </w:r>
           </w:p>
         </w:tc>
@@ -810,7 +810,7 @@
                 <w:color w:val="000000"/>
                 <w:sz w:val="19"/>
               </w:rPr>
-              <w:t>0.0%</w:t>
+              <w:t>33.7%</w:t>
             </w:r>
           </w:p>
         </w:tc>
@@ -864,7 +864,7 @@
                 <w:color w:val="000000"/>
                 <w:sz w:val="19"/>
               </w:rPr>
-              <w:t>0.00 km</w:t>
+              <w:t>9.79 km</w:t>
             </w:r>
           </w:p>
         </w:tc>
@@ -891,7 +891,7 @@
                 <w:color w:val="000000"/>
                 <w:sz w:val="19"/>
               </w:rPr>
-              <w:t>0.0%</w:t>
+              <w:t>41.8%</w:t>
             </w:r>
           </w:p>
         </w:tc>
@@ -1716,7 +1716,7 @@
                 <w:color w:val="000000"/>
                 <w:sz w:val="19"/>
               </w:rPr>
-              <w:t>Run</w:t>
+              <w:t>Run: Running</w:t>
             </w:r>
           </w:p>
         </w:tc>
@@ -1797,7 +1797,7 @@
                 <w:color w:val="000000"/>
                 <w:sz w:val="19"/>
               </w:rPr>
-              <w:t>0分</w:t>
+              <w:t>64分 / 9.79km</w:t>
             </w:r>
           </w:p>
         </w:tc>
@@ -1824,7 +1824,7 @@
                 <w:color w:val="000000"/>
                 <w:sz w:val="19"/>
               </w:rPr>
-              <w:t>❌ 未執行/待排程</w:t>
+              <w:t>⚡ 超額完成 (107%, A)</w:t>
             </w:r>
           </w:p>
         </w:tc>
@@ -2847,7 +2847,7 @@
     </w:p>
     <w:p>
       <w:r>
-        <w:t>• 當週累積自行車 0.00 km、跑步 0.00 km、游泳 3.40 km，整體時間執行率達 10.1%。</w:t>
+        <w:t>• 當週累積自行車 0.00 km、跑步 9.79 km、游泳 3.40 km，整體時間執行率達 19.3%。</w:t>
         <w:br/>
       </w:r>
       <w:r>

</xml_diff>

<commit_message>
feat(sync): update 2026-08-27 TEMPO 56 workout and sync W35 dashboard
</commit_message>
<xml_diff>
--- a/docs/weekly/2026-W35_當週執行率回顧報告.docx
+++ b/docs/weekly/2026-W35_當週執行率回顧報告.docx
@@ -21,7 +21,7 @@
           <w:color w:val="555555"/>
           <w:sz w:val="20"/>
         </w:rPr>
-        <w:t>週期：2026/08/24–2026/08/30　｜　整體時間執行率：19.3%</w:t>
+        <w:t>週期：2026/08/24–2026/08/30　｜　整體時間執行率：30.0%</w:t>
       </w:r>
     </w:p>
     <w:p>
@@ -565,7 +565,7 @@
                 <w:color w:val="000000"/>
                 <w:sz w:val="19"/>
               </w:rPr>
-              <w:t>0.00 hr</w:t>
+              <w:t>1.25 hr</w:t>
             </w:r>
           </w:p>
         </w:tc>
@@ -592,7 +592,7 @@
                 <w:color w:val="000000"/>
                 <w:sz w:val="19"/>
               </w:rPr>
-              <w:t>0.0%</w:t>
+              <w:t>26.3%</w:t>
             </w:r>
           </w:p>
         </w:tc>
@@ -646,7 +646,7 @@
                 <w:color w:val="000000"/>
                 <w:sz w:val="19"/>
               </w:rPr>
-              <w:t>0.00 km</w:t>
+              <w:t>37.27 km</w:t>
             </w:r>
           </w:p>
         </w:tc>
@@ -1963,7 +1963,7 @@
                 <w:color w:val="000000"/>
                 <w:sz w:val="19"/>
               </w:rPr>
-              <w:t>0分</w:t>
+              <w:t>75分 / 37.27km</w:t>
             </w:r>
           </w:p>
         </w:tc>
@@ -1990,7 +1990,7 @@
                 <w:color w:val="000000"/>
                 <w:sz w:val="19"/>
               </w:rPr>
-              <w:t>❌ 未執行/待排程</w:t>
+              <w:t>✅ 精準達標 (100%, A+)</w:t>
             </w:r>
           </w:p>
         </w:tc>
@@ -2847,7 +2847,7 @@
     </w:p>
     <w:p>
       <w:r>
-        <w:t>• 當週累積自行車 0.00 km、跑步 9.79 km、游泳 3.40 km，整體時間執行率達 19.3%。</w:t>
+        <w:t>• 當週累積自行車 37.27 km、跑步 9.79 km、游泳 3.40 km，整體時間執行率達 30.0%。</w:t>
         <w:br/>
       </w:r>
       <w:r>

</xml_diff>

<commit_message>
Auto Daily 8:00 PM Dashboard Update [2026-08-28 08:18]
</commit_message>
<xml_diff>
--- a/docs/weekly/2026-W35_當週執行率回顧報告.docx
+++ b/docs/weekly/2026-W35_當週執行率回顧報告.docx
@@ -21,7 +21,7 @@
           <w:color w:val="555555"/>
           <w:sz w:val="20"/>
         </w:rPr>
-        <w:t>週期：2026/08/24–2026/08/30　｜　整體時間執行率：30.0%</w:t>
+        <w:t>週期：2026/08/24–2026/08/30　｜　整體時間執行率：45.6%</w:t>
       </w:r>
     </w:p>
     <w:p>
@@ -347,7 +347,7 @@
                 <w:color w:val="000000"/>
                 <w:sz w:val="19"/>
               </w:rPr>
-              <w:t>1.18 hr</w:t>
+              <w:t>2.25 hr</w:t>
             </w:r>
           </w:p>
         </w:tc>
@@ -374,7 +374,7 @@
                 <w:color w:val="000000"/>
                 <w:sz w:val="19"/>
               </w:rPr>
-              <w:t>31.6%</w:t>
+              <w:t>60.0%</w:t>
             </w:r>
           </w:p>
         </w:tc>
@@ -428,7 +428,7 @@
                 <w:color w:val="000000"/>
                 <w:sz w:val="19"/>
               </w:rPr>
-              <w:t>3.40 km</w:t>
+              <w:t>6.45 km</w:t>
             </w:r>
           </w:p>
         </w:tc>
@@ -455,7 +455,7 @@
                 <w:color w:val="000000"/>
                 <w:sz w:val="19"/>
               </w:rPr>
-              <w:t>113.3%</w:t>
+              <w:t>215.0%</w:t>
             </w:r>
           </w:p>
         </w:tc>
@@ -783,7 +783,7 @@
                 <w:color w:val="000000"/>
                 <w:sz w:val="19"/>
               </w:rPr>
-              <w:t>1.07 hr</w:t>
+              <w:t>1.82 hr</w:t>
             </w:r>
           </w:p>
         </w:tc>
@@ -810,7 +810,7 @@
                 <w:color w:val="000000"/>
                 <w:sz w:val="19"/>
               </w:rPr>
-              <w:t>33.7%</w:t>
+              <w:t>57.4%</w:t>
             </w:r>
           </w:p>
         </w:tc>
@@ -864,7 +864,7 @@
                 <w:color w:val="000000"/>
                 <w:sz w:val="19"/>
               </w:rPr>
-              <w:t>9.79 km</w:t>
+              <w:t>14.45 km</w:t>
             </w:r>
           </w:p>
         </w:tc>
@@ -891,7 +891,7 @@
                 <w:color w:val="000000"/>
                 <w:sz w:val="19"/>
               </w:rPr>
-              <w:t>41.8%</w:t>
+              <w:t>61.8%</w:t>
             </w:r>
           </w:p>
         </w:tc>
@@ -918,7 +918,7 @@
                 <w:color w:val="000000"/>
                 <w:sz w:val="19"/>
               </w:rPr>
-              <w:t>3</w:t>
+              <w:t>4</w:t>
             </w:r>
           </w:p>
         </w:tc>
@@ -2019,6 +2019,172 @@
                 <w:color w:val="000000"/>
                 <w:sz w:val="19"/>
               </w:rPr>
+              <w:t>08/27</w:t>
+              <w:br/>
+              <w:t>週四</w:t>
+            </w:r>
+          </w:p>
+        </w:tc>
+        <w:tc>
+          <w:tcPr>
+            <w:tcW w:type="dxa" w:w="2750"/>
+            <w:tcMar>
+              <w:top w:w="80" w:type="dxa"/>
+              <w:start w:w="120" w:type="dxa"/>
+              <w:bottom w:w="80" w:type="dxa"/>
+              <w:end w:w="120" w:type="dxa"/>
+            </w:tcMar>
+            <w:vAlign w:val="center"/>
+          </w:tcPr>
+          <w:p>
+            <w:pPr>
+              <w:spacing w:after="0"/>
+              <w:jc w:val="left"/>
+            </w:pPr>
+            <w:r>
+              <w:rPr>
+                <w:rFonts w:ascii="Calibri" w:hAnsi="Calibri" w:eastAsia="Microsoft JhengHei"/>
+                <w:b w:val="0"/>
+                <w:color w:val="000000"/>
+                <w:sz w:val="19"/>
+              </w:rPr>
+              <w:t>Run: Treadmill Running</w:t>
+            </w:r>
+          </w:p>
+        </w:tc>
+        <w:tc>
+          <w:tcPr>
+            <w:tcW w:type="dxa" w:w="1050"/>
+            <w:tcMar>
+              <w:top w:w="80" w:type="dxa"/>
+              <w:start w:w="120" w:type="dxa"/>
+              <w:bottom w:w="80" w:type="dxa"/>
+              <w:end w:w="120" w:type="dxa"/>
+            </w:tcMar>
+            <w:vAlign w:val="center"/>
+          </w:tcPr>
+          <w:p>
+            <w:pPr>
+              <w:spacing w:after="0"/>
+              <w:jc w:val="center"/>
+            </w:pPr>
+            <w:r>
+              <w:rPr>
+                <w:rFonts w:ascii="Calibri" w:hAnsi="Calibri" w:eastAsia="Microsoft JhengHei"/>
+                <w:b w:val="0"/>
+                <w:color w:val="000000"/>
+                <w:sz w:val="19"/>
+              </w:rPr>
+              <w:t>Run</w:t>
+            </w:r>
+          </w:p>
+        </w:tc>
+        <w:tc>
+          <w:tcPr>
+            <w:tcW w:type="dxa" w:w="1500"/>
+            <w:tcMar>
+              <w:top w:w="80" w:type="dxa"/>
+              <w:start w:w="120" w:type="dxa"/>
+              <w:bottom w:w="80" w:type="dxa"/>
+              <w:end w:w="120" w:type="dxa"/>
+            </w:tcMar>
+            <w:vAlign w:val="center"/>
+          </w:tcPr>
+          <w:p>
+            <w:pPr>
+              <w:spacing w:after="0"/>
+              <w:jc w:val="center"/>
+            </w:pPr>
+            <w:r>
+              <w:rPr>
+                <w:rFonts w:ascii="Calibri" w:hAnsi="Calibri" w:eastAsia="Microsoft JhengHei"/>
+                <w:b w:val="0"/>
+                <w:color w:val="000000"/>
+                <w:sz w:val="19"/>
+              </w:rPr>
+              <w:t>0分</w:t>
+            </w:r>
+          </w:p>
+        </w:tc>
+        <w:tc>
+          <w:tcPr>
+            <w:tcW w:type="dxa" w:w="1500"/>
+            <w:tcMar>
+              <w:top w:w="80" w:type="dxa"/>
+              <w:start w:w="120" w:type="dxa"/>
+              <w:bottom w:w="80" w:type="dxa"/>
+              <w:end w:w="120" w:type="dxa"/>
+            </w:tcMar>
+            <w:vAlign w:val="center"/>
+          </w:tcPr>
+          <w:p>
+            <w:pPr>
+              <w:spacing w:after="0"/>
+              <w:jc w:val="center"/>
+            </w:pPr>
+            <w:r>
+              <w:rPr>
+                <w:rFonts w:ascii="Calibri" w:hAnsi="Calibri" w:eastAsia="Microsoft JhengHei"/>
+                <w:b w:val="0"/>
+                <w:color w:val="000000"/>
+                <w:sz w:val="19"/>
+              </w:rPr>
+              <w:t>45分 / 4.66km</w:t>
+            </w:r>
+          </w:p>
+        </w:tc>
+        <w:tc>
+          <w:tcPr>
+            <w:tcW w:type="dxa" w:w="1810"/>
+            <w:tcMar>
+              <w:top w:w="80" w:type="dxa"/>
+              <w:start w:w="120" w:type="dxa"/>
+              <w:bottom w:w="80" w:type="dxa"/>
+              <w:end w:w="120" w:type="dxa"/>
+            </w:tcMar>
+            <w:vAlign w:val="center"/>
+          </w:tcPr>
+          <w:p>
+            <w:pPr>
+              <w:spacing w:after="0"/>
+              <w:jc w:val="center"/>
+            </w:pPr>
+            <w:r>
+              <w:rPr>
+                <w:rFonts w:ascii="Calibri" w:hAnsi="Calibri" w:eastAsia="Microsoft JhengHei"/>
+                <w:b w:val="0"/>
+                <w:color w:val="000000"/>
+                <w:sz w:val="19"/>
+              </w:rPr>
+              <w:t>✨ 動態排酸 (A)</w:t>
+            </w:r>
+          </w:p>
+        </w:tc>
+      </w:tr>
+      <w:tr>
+        <w:tc>
+          <w:tcPr>
+            <w:tcW w:type="dxa" w:w="1050"/>
+            <w:tcMar>
+              <w:top w:w="80" w:type="dxa"/>
+              <w:start w:w="120" w:type="dxa"/>
+              <w:bottom w:w="80" w:type="dxa"/>
+              <w:end w:w="120" w:type="dxa"/>
+            </w:tcMar>
+            <w:vAlign w:val="center"/>
+          </w:tcPr>
+          <w:p>
+            <w:pPr>
+              <w:spacing w:after="0"/>
+              <w:jc w:val="center"/>
+            </w:pPr>
+            <w:r>
+              <w:rPr>
+                <w:rFonts w:ascii="Calibri" w:hAnsi="Calibri" w:eastAsia="Microsoft JhengHei"/>
+                <w:b w:val="0"/>
+                <w:color w:val="000000"/>
+                <w:sz w:val="19"/>
+              </w:rPr>
               <w:t>08/28</w:t>
               <w:br/>
               <w:t>週五</w:t>
@@ -2129,7 +2295,7 @@
                 <w:color w:val="000000"/>
                 <w:sz w:val="19"/>
               </w:rPr>
-              <w:t>0分</w:t>
+              <w:t>64分 / 3.05km</w:t>
             </w:r>
           </w:p>
         </w:tc>
@@ -2156,7 +2322,7 @@
                 <w:color w:val="000000"/>
                 <w:sz w:val="19"/>
               </w:rPr>
-              <w:t>❌ 未執行/待排程</w:t>
+              <w:t>🟢 良好達標 (80%, A-)</w:t>
             </w:r>
           </w:p>
         </w:tc>
@@ -2847,7 +3013,7 @@
     </w:p>
     <w:p>
       <w:r>
-        <w:t>• 當週累積自行車 37.27 km、跑步 9.79 km、游泳 3.40 km，整體時間執行率達 30.0%。</w:t>
+        <w:t>• 當週累積自行車 37.27 km、跑步 14.45 km、游泳 6.45 km，整體時間執行率達 45.6%。</w:t>
         <w:br/>
       </w:r>
       <w:r>

</xml_diff>

<commit_message>
Auto Daily 8:00 PM Dashboard Update [2026-08-28 20:01]
</commit_message>
<xml_diff>
--- a/docs/weekly/2026-W35_當週執行率回顧報告.docx
+++ b/docs/weekly/2026-W35_當週執行率回顧報告.docx
@@ -21,7 +21,7 @@
           <w:color w:val="555555"/>
           <w:sz w:val="20"/>
         </w:rPr>
-        <w:t>週期：2026/08/24–2026/08/30　｜　整體時間執行率：45.6%</w:t>
+        <w:t>週期：2026/08/24–2026/08/30　｜　整體時間執行率：49.4%</w:t>
       </w:r>
     </w:p>
     <w:p>
@@ -565,7 +565,7 @@
                 <w:color w:val="000000"/>
                 <w:sz w:val="19"/>
               </w:rPr>
-              <w:t>1.25 hr</w:t>
+              <w:t>1.70 hr</w:t>
             </w:r>
           </w:p>
         </w:tc>
@@ -592,7 +592,7 @@
                 <w:color w:val="000000"/>
                 <w:sz w:val="19"/>
               </w:rPr>
-              <w:t>26.3%</w:t>
+              <w:t>35.8%</w:t>
             </w:r>
           </w:p>
         </w:tc>
@@ -646,7 +646,7 @@
                 <w:color w:val="000000"/>
                 <w:sz w:val="19"/>
               </w:rPr>
-              <w:t>37.27 km</w:t>
+              <w:t>44.27 km</w:t>
             </w:r>
           </w:p>
         </w:tc>
@@ -700,7 +700,7 @@
                 <w:color w:val="000000"/>
                 <w:sz w:val="19"/>
               </w:rPr>
-              <w:t>2</w:t>
+              <w:t>3</w:t>
             </w:r>
           </w:p>
         </w:tc>
@@ -2214,6 +2214,172 @@
                 <w:color w:val="000000"/>
                 <w:sz w:val="19"/>
               </w:rPr>
+              <w:t>Bike: Cycling</w:t>
+            </w:r>
+          </w:p>
+        </w:tc>
+        <w:tc>
+          <w:tcPr>
+            <w:tcW w:type="dxa" w:w="1050"/>
+            <w:tcMar>
+              <w:top w:w="80" w:type="dxa"/>
+              <w:start w:w="120" w:type="dxa"/>
+              <w:bottom w:w="80" w:type="dxa"/>
+              <w:end w:w="120" w:type="dxa"/>
+            </w:tcMar>
+            <w:vAlign w:val="center"/>
+          </w:tcPr>
+          <w:p>
+            <w:pPr>
+              <w:spacing w:after="0"/>
+              <w:jc w:val="center"/>
+            </w:pPr>
+            <w:r>
+              <w:rPr>
+                <w:rFonts w:ascii="Calibri" w:hAnsi="Calibri" w:eastAsia="Microsoft JhengHei"/>
+                <w:b w:val="0"/>
+                <w:color w:val="000000"/>
+                <w:sz w:val="19"/>
+              </w:rPr>
+              <w:t>Bike</w:t>
+            </w:r>
+          </w:p>
+        </w:tc>
+        <w:tc>
+          <w:tcPr>
+            <w:tcW w:type="dxa" w:w="1500"/>
+            <w:tcMar>
+              <w:top w:w="80" w:type="dxa"/>
+              <w:start w:w="120" w:type="dxa"/>
+              <w:bottom w:w="80" w:type="dxa"/>
+              <w:end w:w="120" w:type="dxa"/>
+            </w:tcMar>
+            <w:vAlign w:val="center"/>
+          </w:tcPr>
+          <w:p>
+            <w:pPr>
+              <w:spacing w:after="0"/>
+              <w:jc w:val="center"/>
+            </w:pPr>
+            <w:r>
+              <w:rPr>
+                <w:rFonts w:ascii="Calibri" w:hAnsi="Calibri" w:eastAsia="Microsoft JhengHei"/>
+                <w:b w:val="0"/>
+                <w:color w:val="000000"/>
+                <w:sz w:val="19"/>
+              </w:rPr>
+              <w:t>0分</w:t>
+            </w:r>
+          </w:p>
+        </w:tc>
+        <w:tc>
+          <w:tcPr>
+            <w:tcW w:type="dxa" w:w="1500"/>
+            <w:tcMar>
+              <w:top w:w="80" w:type="dxa"/>
+              <w:start w:w="120" w:type="dxa"/>
+              <w:bottom w:w="80" w:type="dxa"/>
+              <w:end w:w="120" w:type="dxa"/>
+            </w:tcMar>
+            <w:vAlign w:val="center"/>
+          </w:tcPr>
+          <w:p>
+            <w:pPr>
+              <w:spacing w:after="0"/>
+              <w:jc w:val="center"/>
+            </w:pPr>
+            <w:r>
+              <w:rPr>
+                <w:rFonts w:ascii="Calibri" w:hAnsi="Calibri" w:eastAsia="Microsoft JhengHei"/>
+                <w:b w:val="0"/>
+                <w:color w:val="000000"/>
+                <w:sz w:val="19"/>
+              </w:rPr>
+              <w:t>27分 / 7.00km</w:t>
+            </w:r>
+          </w:p>
+        </w:tc>
+        <w:tc>
+          <w:tcPr>
+            <w:tcW w:type="dxa" w:w="1810"/>
+            <w:tcMar>
+              <w:top w:w="80" w:type="dxa"/>
+              <w:start w:w="120" w:type="dxa"/>
+              <w:bottom w:w="80" w:type="dxa"/>
+              <w:end w:w="120" w:type="dxa"/>
+            </w:tcMar>
+            <w:vAlign w:val="center"/>
+          </w:tcPr>
+          <w:p>
+            <w:pPr>
+              <w:spacing w:after="0"/>
+              <w:jc w:val="center"/>
+            </w:pPr>
+            <w:r>
+              <w:rPr>
+                <w:rFonts w:ascii="Calibri" w:hAnsi="Calibri" w:eastAsia="Microsoft JhengHei"/>
+                <w:b w:val="0"/>
+                <w:color w:val="000000"/>
+                <w:sz w:val="19"/>
+              </w:rPr>
+              <w:t>✨ 動態排酸 (A)</w:t>
+            </w:r>
+          </w:p>
+        </w:tc>
+      </w:tr>
+      <w:tr>
+        <w:tc>
+          <w:tcPr>
+            <w:tcW w:type="dxa" w:w="1050"/>
+            <w:tcMar>
+              <w:top w:w="80" w:type="dxa"/>
+              <w:start w:w="120" w:type="dxa"/>
+              <w:bottom w:w="80" w:type="dxa"/>
+              <w:end w:w="120" w:type="dxa"/>
+            </w:tcMar>
+            <w:vAlign w:val="center"/>
+          </w:tcPr>
+          <w:p>
+            <w:pPr>
+              <w:spacing w:after="0"/>
+              <w:jc w:val="center"/>
+            </w:pPr>
+            <w:r>
+              <w:rPr>
+                <w:rFonts w:ascii="Calibri" w:hAnsi="Calibri" w:eastAsia="Microsoft JhengHei"/>
+                <w:b w:val="0"/>
+                <w:color w:val="000000"/>
+                <w:sz w:val="19"/>
+              </w:rPr>
+              <w:t>08/28</w:t>
+              <w:br/>
+              <w:t>週五</w:t>
+            </w:r>
+          </w:p>
+        </w:tc>
+        <w:tc>
+          <w:tcPr>
+            <w:tcW w:type="dxa" w:w="2750"/>
+            <w:tcMar>
+              <w:top w:w="80" w:type="dxa"/>
+              <w:start w:w="120" w:type="dxa"/>
+              <w:bottom w:w="80" w:type="dxa"/>
+              <w:end w:w="120" w:type="dxa"/>
+            </w:tcMar>
+            <w:vAlign w:val="center"/>
+          </w:tcPr>
+          <w:p>
+            <w:pPr>
+              <w:spacing w:after="0"/>
+              <w:jc w:val="left"/>
+            </w:pPr>
+            <w:r>
+              <w:rPr>
+                <w:rFonts w:ascii="Calibri" w:hAnsi="Calibri" w:eastAsia="Microsoft JhengHei"/>
+                <w:b w:val="0"/>
+                <w:color w:val="000000"/>
+                <w:sz w:val="19"/>
+              </w:rPr>
               <w:t>Swim: 甜甜課表</w:t>
             </w:r>
           </w:p>
@@ -3013,7 +3179,7 @@
     </w:p>
     <w:p>
       <w:r>
-        <w:t>• 當週累積自行車 37.27 km、跑步 14.45 km、游泳 6.45 km，整體時間執行率達 45.6%。</w:t>
+        <w:t>• 當週累積自行車 44.27 km、跑步 14.45 km、游泳 6.45 km，整體時間執行率達 49.4%。</w:t>
         <w:br/>
       </w:r>
       <w:r>

</xml_diff>

<commit_message>
feat: sync 08/29 bike and brick run workouts and update W35 dashboard
</commit_message>
<xml_diff>
--- a/docs/weekly/2026-W35_當週執行率回顧報告.docx
+++ b/docs/weekly/2026-W35_當週執行率回顧報告.docx
@@ -21,7 +21,7 @@
           <w:color w:val="555555"/>
           <w:sz w:val="20"/>
         </w:rPr>
-        <w:t>週期：2026/08/24–2026/08/30　｜　整體時間執行率：49.4%</w:t>
+        <w:t>週期：2026/08/24–2026/08/30　｜　整體時間執行率：87.6%</w:t>
       </w:r>
     </w:p>
     <w:p>
@@ -565,7 +565,7 @@
                 <w:color w:val="000000"/>
                 <w:sz w:val="19"/>
               </w:rPr>
-              <w:t>1.70 hr</w:t>
+              <w:t>5.50 hr</w:t>
             </w:r>
           </w:p>
         </w:tc>
@@ -592,7 +592,7 @@
                 <w:color w:val="000000"/>
                 <w:sz w:val="19"/>
               </w:rPr>
-              <w:t>35.8%</w:t>
+              <w:t>115.8%</w:t>
             </w:r>
           </w:p>
         </w:tc>
@@ -646,7 +646,7 @@
                 <w:color w:val="000000"/>
                 <w:sz w:val="19"/>
               </w:rPr>
-              <w:t>44.27 km</w:t>
+              <w:t>133.82 km</w:t>
             </w:r>
           </w:p>
         </w:tc>
@@ -783,7 +783,7 @@
                 <w:color w:val="000000"/>
                 <w:sz w:val="19"/>
               </w:rPr>
-              <w:t>1.82 hr</w:t>
+              <w:t>2.47 hr</w:t>
             </w:r>
           </w:p>
         </w:tc>
@@ -810,7 +810,7 @@
                 <w:color w:val="000000"/>
                 <w:sz w:val="19"/>
               </w:rPr>
-              <w:t>57.4%</w:t>
+              <w:t>77.9%</w:t>
             </w:r>
           </w:p>
         </w:tc>
@@ -864,7 +864,7 @@
                 <w:color w:val="000000"/>
                 <w:sz w:val="19"/>
               </w:rPr>
-              <w:t>14.45 km</w:t>
+              <w:t>20.43 km</w:t>
             </w:r>
           </w:p>
         </w:tc>
@@ -891,7 +891,7 @@
                 <w:color w:val="000000"/>
                 <w:sz w:val="19"/>
               </w:rPr>
-              <w:t>61.8%</w:t>
+              <w:t>87.3%</w:t>
             </w:r>
           </w:p>
         </w:tc>
@@ -2627,7 +2627,7 @@
                 <w:color w:val="000000"/>
                 <w:sz w:val="19"/>
               </w:rPr>
-              <w:t>0分</w:t>
+              <w:t>228分 / 89.55km</w:t>
             </w:r>
           </w:p>
         </w:tc>
@@ -2654,7 +2654,7 @@
                 <w:color w:val="000000"/>
                 <w:sz w:val="19"/>
               </w:rPr>
-              <w:t>❌ 未執行/待排程</w:t>
+              <w:t>⚡ 超額完成 (109%, A)</w:t>
             </w:r>
           </w:p>
         </w:tc>
@@ -2793,7 +2793,7 @@
                 <w:color w:val="000000"/>
                 <w:sz w:val="19"/>
               </w:rPr>
-              <w:t>0分</w:t>
+              <w:t>39分 / 5.98km</w:t>
             </w:r>
           </w:p>
         </w:tc>
@@ -2820,7 +2820,7 @@
                 <w:color w:val="000000"/>
                 <w:sz w:val="19"/>
               </w:rPr>
-              <w:t>❌ 未執行/待排程</w:t>
+              <w:t>✅ 精準達標 (98%, A+)</w:t>
             </w:r>
           </w:p>
         </w:tc>
@@ -3179,11 +3179,27 @@
     </w:p>
     <w:p>
       <w:r>
-        <w:t>• 當週累積自行車 44.27 km、跑步 14.45 km、游泳 6.45 km，整體時間執行率達 49.4%。</w:t>
+        <w:t>• 當週累積自行車 133.82 km、跑步 20.43 km、游泳 6.45 km，整體時間執行率達 87.6%。</w:t>
         <w:br/>
       </w:r>
       <w:r>
-        <w:t>• 在高負荷訓練後無縫銜接轉換跑，並依據即時心率與體感自覺彈性調整，兼顧神經肌肉適應與傷害防範。</w:t>
+        <w:t>• Base 3-4 (Recovery) 減量與超量吸收週扎實執行：在控制總時數的同時，維持長距離耐力與關鍵轉換刺激，疲勞控制與體感維持極佳狀態。</w:t>
+        <w:br/>
+      </w:r>
+      <w:r>
+        <w:t>• 週六長距離單車 89.55km ＋ 轉換跑 40 分鐘高質量完成：8/29 長騎 3:49 (NP 171W, 均心 129 bpm, 243.5 TSS) 達成率 109%，心率 80% 穩健落在 Z1-Z2；下車後無縫換鞋執行 39:49 轉換跑 (5.98km, 6:39/km, 均心 158 bpm Z2, 均瓦 240W, 步頻 170 spm)，體感滿分 5/5，完美模擬鐵人下車轉向適應！</w:t>
+        <w:br/>
+      </w:r>
+      <w:r>
+        <w:t>• 週四單車 TEMPO 56 (37.27km) 階梯漸進達標：8/27 單車 75 分鐘 (NP 148W, 148 bpm, TSS 65.0, VI 1.03) 踏頻穩在 84 rpm，高質量刺激有氧引擎。</w:t>
+        <w:br/>
+      </w:r>
+      <w:r>
+        <w:t>• 週二 Z2 有氧跑 9.79km 穩健巡航：8/26 跑步 64 分鐘 (6:34/km, 145 bpm)，步頻 174 spm，粒線體有氧打底效果優異。</w:t>
+        <w:br/>
+      </w:r>
+      <w:r>
+        <w:t>• 週三甜甜泳課 3.40km 水感延伸：8/25 游泳 71 分鐘 (2:06/100m, 136 bpm)，核心流線型支撐與划幅穩定。</w:t>
         <w:br/>
       </w:r>
     </w:p>

</xml_diff>

<commit_message>
feat(sync): update 2026-08-30 run and swim workouts, finalize W35 recovery report and deploy dashboard
</commit_message>
<xml_diff>
--- a/docs/weekly/2026-W35_當週執行率回顧報告.docx
+++ b/docs/weekly/2026-W35_當週執行率回顧報告.docx
@@ -21,7 +21,7 @@
           <w:color w:val="555555"/>
           <w:sz w:val="20"/>
         </w:rPr>
-        <w:t>週期：2026/08/24–2026/08/30　｜　整體時間執行率：87.6%</w:t>
+        <w:t>週期：2026/08/24–2026/08/30　｜　整體時間執行率：107.9%</w:t>
       </w:r>
     </w:p>
     <w:p>
@@ -347,7 +347,7 @@
                 <w:color w:val="000000"/>
                 <w:sz w:val="19"/>
               </w:rPr>
-              <w:t>2.25 hr</w:t>
+              <w:t>3.37 hr</w:t>
             </w:r>
           </w:p>
         </w:tc>
@@ -374,7 +374,7 @@
                 <w:color w:val="000000"/>
                 <w:sz w:val="19"/>
               </w:rPr>
-              <w:t>60.0%</w:t>
+              <w:t>89.8%</w:t>
             </w:r>
           </w:p>
         </w:tc>
@@ -428,7 +428,7 @@
                 <w:color w:val="000000"/>
                 <w:sz w:val="19"/>
               </w:rPr>
-              <w:t>6.45 km</w:t>
+              <w:t>9.40 km</w:t>
             </w:r>
           </w:p>
         </w:tc>
@@ -455,7 +455,7 @@
                 <w:color w:val="000000"/>
                 <w:sz w:val="19"/>
               </w:rPr>
-              <w:t>215.0%</w:t>
+              <w:t>313.3%</w:t>
             </w:r>
           </w:p>
         </w:tc>
@@ -783,7 +783,7 @@
                 <w:color w:val="000000"/>
                 <w:sz w:val="19"/>
               </w:rPr>
-              <w:t>2.47 hr</w:t>
+              <w:t>3.72 hr</w:t>
             </w:r>
           </w:p>
         </w:tc>
@@ -810,7 +810,7 @@
                 <w:color w:val="000000"/>
                 <w:sz w:val="19"/>
               </w:rPr>
-              <w:t>77.9%</w:t>
+              <w:t>117.4%</w:t>
             </w:r>
           </w:p>
         </w:tc>
@@ -864,7 +864,7 @@
                 <w:color w:val="000000"/>
                 <w:sz w:val="19"/>
               </w:rPr>
-              <w:t>20.43 km</w:t>
+              <w:t>31.10 km</w:t>
             </w:r>
           </w:p>
         </w:tc>
@@ -891,7 +891,7 @@
                 <w:color w:val="000000"/>
                 <w:sz w:val="19"/>
               </w:rPr>
-              <w:t>87.3%</w:t>
+              <w:t>132.9%</w:t>
             </w:r>
           </w:p>
         </w:tc>
@@ -2959,7 +2959,7 @@
                 <w:color w:val="000000"/>
                 <w:sz w:val="19"/>
               </w:rPr>
-              <w:t>0分</w:t>
+              <w:t>75分 / 10.67km</w:t>
             </w:r>
           </w:p>
         </w:tc>
@@ -2986,7 +2986,7 @@
                 <w:color w:val="000000"/>
                 <w:sz w:val="19"/>
               </w:rPr>
-              <w:t>❌ 未執行/待排程</w:t>
+              <w:t>🟢 良好達標 (83%, A-)</w:t>
             </w:r>
           </w:p>
         </w:tc>
@@ -3125,7 +3125,7 @@
                 <w:color w:val="000000"/>
                 <w:sz w:val="19"/>
               </w:rPr>
-              <w:t>0分</w:t>
+              <w:t>67分 / 2.95km</w:t>
             </w:r>
           </w:p>
         </w:tc>
@@ -3152,7 +3152,7 @@
                 <w:color w:val="000000"/>
                 <w:sz w:val="19"/>
               </w:rPr>
-              <w:t>❌ 未執行/待排程</w:t>
+              <w:t>✅ 精準達標 (103%, A+)</w:t>
             </w:r>
           </w:p>
         </w:tc>
@@ -3179,11 +3179,15 @@
     </w:p>
     <w:p>
       <w:r>
-        <w:t>• 當週累積自行車 133.82 km、跑步 20.43 km、游泳 6.45 km，整體時間執行率達 87.6%。</w:t>
+        <w:t>• 當週累積自行車 133.82 km、跑步 31.10 km、游泳 9.40 km，整體時間執行率達 107.9%。</w:t>
         <w:br/>
       </w:r>
       <w:r>
-        <w:t>• Base 3-4 (Recovery) 減量與超量吸收週扎實執行：在控制總時數的同時，維持長距離耐力與關鍵轉換刺激，疲勞控制與體感維持極佳狀態。</w:t>
+        <w:t>• Base 3-4 (Recovery) 減量與超量吸收週圓滿結算：在控制總時數的同時，維持長距離耐力與關鍵轉換刺激，疲勞控制與體感維持極佳狀態。</w:t>
+        <w:br/>
+      </w:r>
+      <w:r>
+        <w:t>• 週日跑游雙課表極佳有氧控制：8/30 晨跑 75 分鐘 (10.67km, 7:02/km, 均心 131 bpm 完美控在 140 bpm 上限內, 均瓦 227W 3.32W/kg, 脫鉤率 3.12%, rTSS 45.6)；上午接續 50m 長池游泳 2,950m (含 20 組 Drill 與 2 組 800m @ 1:56~1:57/100m 均速, sTSS 65.5)，水感與核心流線型發揮出色！</w:t>
         <w:br/>
       </w:r>
       <w:r>

</xml_diff>

<commit_message>
Fix planned distance calculation and review report loading in dashboard
</commit_message>
<xml_diff>
--- a/docs/weekly/2026-W35_當週執行率回顧報告.docx
+++ b/docs/weekly/2026-W35_當週執行率回顧報告.docx
@@ -619,7 +619,7 @@
                 <w:color w:val="000000"/>
                 <w:sz w:val="19"/>
               </w:rPr>
-              <w:t>0.00 km</w:t>
+              <w:t>-</w:t>
             </w:r>
           </w:p>
         </w:tc>
@@ -673,7 +673,7 @@
                 <w:color w:val="000000"/>
                 <w:sz w:val="19"/>
               </w:rPr>
-              <w:t>0.0%</w:t>
+              <w:t>-</w:t>
             </w:r>
           </w:p>
         </w:tc>

</xml_diff>